<commit_message>
Se creo el apk
</commit_message>
<xml_diff>
--- a/Documentacion/Manual Tecnico.docx
+++ b/Documentacion/Manual Tecnico.docx
@@ -545,7 +545,6 @@
           <w:lang w:val="es-GT"/>
         </w:rPr>
       </w:pPr>
-      <w:proofErr w:type="gramStart"/>
       <w:r>
         <w:rPr>
           <w:b/>
@@ -570,7 +569,6 @@
         </w:rPr>
         <w:t>.analizadores</w:t>
       </w:r>
-      <w:proofErr w:type="gramEnd"/>
       <w:r>
         <w:rPr>
           <w:lang w:val="es-GT"/>
@@ -593,14 +591,7 @@
         <w:rPr>
           <w:lang w:val="es-GT"/>
         </w:rPr>
-        <w:t xml:space="preserve">Archivos </w:t>
-      </w:r>
-      <w:proofErr w:type="gramStart"/>
-      <w:r>
-        <w:rPr>
-          <w:lang w:val="es-GT"/>
-        </w:rPr>
-        <w:t>fuente .</w:t>
+        <w:t>Archivos fuente .</w:t>
       </w:r>
       <w:proofErr w:type="spellStart"/>
       <w:r>
@@ -610,26 +601,11 @@
         <w:t>jflex</w:t>
       </w:r>
       <w:proofErr w:type="spellEnd"/>
-      <w:proofErr w:type="gramEnd"/>
-      <w:r>
-        <w:rPr>
-          <w:lang w:val="es-GT"/>
-        </w:rPr>
-        <w:t xml:space="preserve"> </w:t>
-      </w:r>
-      <w:proofErr w:type="gramStart"/>
-      <w:r>
-        <w:rPr>
-          <w:lang w:val="es-GT"/>
-        </w:rPr>
-        <w:t>y .cup</w:t>
-      </w:r>
-      <w:proofErr w:type="gramEnd"/>
-      <w:r>
-        <w:rPr>
-          <w:lang w:val="es-GT"/>
-        </w:rPr>
-        <w:t xml:space="preserve"> que definen las reglas del lenguaje.</w:t>
+      <w:r>
+        <w:rPr>
+          <w:lang w:val="es-GT"/>
+        </w:rPr>
+        <w:t xml:space="preserve"> y .cup que definen las reglas del lenguaje.</w:t>
       </w:r>
     </w:p>
     <w:p>
@@ -709,18 +685,8 @@
           <w:bCs/>
           <w:lang w:val="es-GT"/>
         </w:rPr>
-        <w:t>com.compi1.proyecto</w:t>
-      </w:r>
-      <w:proofErr w:type="gramStart"/>
-      <w:r>
-        <w:rPr>
-          <w:b/>
-          <w:bCs/>
-          <w:lang w:val="es-GT"/>
-        </w:rPr>
-        <w:t>1.modelos</w:t>
-      </w:r>
-      <w:proofErr w:type="gramEnd"/>
+        <w:t>com.compi1.proyecto1.modelos</w:t>
+      </w:r>
       <w:r>
         <w:rPr>
           <w:lang w:val="es-GT"/>
@@ -809,7 +775,6 @@
           <w:lang w:val="es-GT"/>
         </w:rPr>
       </w:pPr>
-      <w:proofErr w:type="gramStart"/>
       <w:r>
         <w:rPr>
           <w:b/>
@@ -818,7 +783,6 @@
         </w:rPr>
         <w:t>com.compi1.proyecto1.interprete</w:t>
       </w:r>
-      <w:proofErr w:type="gramEnd"/>
       <w:r>
         <w:rPr>
           <w:lang w:val="es-GT"/>
@@ -903,14 +867,7 @@
         <w:rPr>
           <w:lang w:val="es-GT"/>
         </w:rPr>
-        <w:t xml:space="preserve">ExportadorPKM: Recorre el árbol final resuelto y serializa los componentes en el formato </w:t>
-      </w:r>
-      <w:proofErr w:type="gramStart"/>
-      <w:r>
-        <w:rPr>
-          <w:lang w:val="es-GT"/>
-        </w:rPr>
-        <w:t>declarativo .</w:t>
+        <w:t>ExportadorPKM: Recorre el árbol final resuelto y serializa los componentes en el formato declarativo .</w:t>
       </w:r>
       <w:proofErr w:type="spellStart"/>
       <w:r>
@@ -920,7 +877,6 @@
         <w:t>pkm</w:t>
       </w:r>
       <w:proofErr w:type="spellEnd"/>
-      <w:proofErr w:type="gramEnd"/>
       <w:r>
         <w:rPr>
           <w:lang w:val="es-GT"/>
@@ -939,23 +895,13 @@
           <w:lang w:val="es-GT"/>
         </w:rPr>
       </w:pPr>
-      <w:proofErr w:type="gramStart"/>
       <w:r>
         <w:rPr>
           <w:b/>
           <w:bCs/>
           <w:lang w:val="es-GT"/>
         </w:rPr>
-        <w:t>com.compi1.proyecto</w:t>
-      </w:r>
-      <w:proofErr w:type="gramEnd"/>
-      <w:r>
-        <w:rPr>
-          <w:b/>
-          <w:bCs/>
-          <w:lang w:val="es-GT"/>
-        </w:rPr>
-        <w:t>1.ui</w:t>
+        <w:t>com.compi1.proyecto1.ui</w:t>
       </w:r>
       <w:r>
         <w:rPr>
@@ -1069,7 +1015,6 @@
           <w:lang w:val="es-GT"/>
         </w:rPr>
       </w:pPr>
-      <w:proofErr w:type="gramStart"/>
       <w:r>
         <w:rPr>
           <w:b/>
@@ -1078,7 +1023,6 @@
         </w:rPr>
         <w:t>com.compi1.proyecto1.utils</w:t>
       </w:r>
-      <w:proofErr w:type="gramEnd"/>
       <w:r>
         <w:rPr>
           <w:lang w:val="es-GT"/>
@@ -1125,7 +1069,7 @@
           <w:lang w:val="es-GT"/>
         </w:rPr>
         <w:pict w14:anchorId="52658BF0">
-          <v:rect id="_x0000_i1055" style="width:0;height:1.5pt" o:hralign="center" o:hrstd="t" o:hr="t" fillcolor="#a0a0a0" stroked="f"/>
+          <v:rect id="_x0000_i1025" style="width:0;height:1.5pt" o:hralign="center" o:hrstd="t" o:hr="t" fillcolor="#a0a0a0" stroked="f"/>
         </w:pict>
       </w:r>
     </w:p>
@@ -1203,6 +1147,7 @@
           <w:bCs/>
           <w:lang w:val="es-GT"/>
         </w:rPr>
+        <w:lastRenderedPageBreak/>
         <w:t>2.1 Analizador Léxico (</w:t>
       </w:r>
       <w:proofErr w:type="spellStart"/>
@@ -1311,28 +1256,13 @@
           <w:bCs/>
           <w:lang w:val="es-GT"/>
         </w:rPr>
-        <w:lastRenderedPageBreak/>
         <w:t>Números:</w:t>
       </w:r>
       <w:r>
         <w:rPr>
           <w:lang w:val="es-GT"/>
         </w:rPr>
-        <w:t xml:space="preserve"> Enteros [0-9]+ y Decimales [0-9]+</w:t>
-      </w:r>
-      <w:proofErr w:type="gramStart"/>
-      <w:r>
-        <w:rPr>
-          <w:lang w:val="es-GT"/>
-        </w:rPr>
-        <w:t>"."[</w:t>
-      </w:r>
-      <w:proofErr w:type="gramEnd"/>
-      <w:r>
-        <w:rPr>
-          <w:lang w:val="es-GT"/>
-        </w:rPr>
-        <w:t>0-9]+</w:t>
+        <w:t xml:space="preserve"> Enteros [0-9]+ y Decimales [0-9]+"."[0-9]+</w:t>
       </w:r>
     </w:p>
     <w:p>
@@ -1402,44 +1332,8 @@
         <w:rPr>
           <w:lang w:val="es-GT"/>
         </w:rPr>
-        <w:t xml:space="preserve"> Se diseñó una expresión estricta para leer textos y fechas (DD/MM/YYYY) sin crear conflictos con los cierres de etiquetas XML (/&gt;): [a-zA-Z_0-9\</w:t>
-      </w:r>
-      <w:proofErr w:type="gramStart"/>
-      <w:r>
-        <w:rPr>
-          <w:lang w:val="es-GT"/>
-        </w:rPr>
-        <w:t>.:@</w:t>
-      </w:r>
-      <w:proofErr w:type="gramEnd"/>
-      <w:r>
-        <w:rPr>
-          <w:lang w:val="es-GT"/>
-        </w:rPr>
-        <w:t>]+ ("/" [a-zA-Z_0-9\</w:t>
-      </w:r>
-      <w:proofErr w:type="gramStart"/>
-      <w:r>
-        <w:rPr>
-          <w:lang w:val="es-GT"/>
-        </w:rPr>
-        <w:t>.:@</w:t>
-      </w:r>
-      <w:proofErr w:type="gramEnd"/>
-      <w:r>
-        <w:rPr>
-          <w:lang w:val="es-GT"/>
-        </w:rPr>
-        <w:t>]</w:t>
-      </w:r>
-      <w:proofErr w:type="gramStart"/>
-      <w:r>
-        <w:rPr>
-          <w:lang w:val="es-GT"/>
-        </w:rPr>
-        <w:t>+)*</w:t>
-      </w:r>
-      <w:proofErr w:type="gramEnd"/>
+        <w:t xml:space="preserve"> Se diseñó una expresión estricta para leer textos y fechas (DD/MM/YYYY) sin crear conflictos con los cierres de etiquetas XML (/&gt;): [a-zA-Z_0-9\.:@]+ ("/" [a-zA-Z_0-9\.:@]+)*</w:t>
+      </w:r>
     </w:p>
     <w:p>
       <w:pPr>
@@ -1472,29 +1366,53 @@
         </w:rPr>
         <w:t xml:space="preserve">Utiliza una gramática </w:t>
       </w:r>
-      <w:proofErr w:type="gramStart"/>
       <w:r>
         <w:rPr>
           <w:b/>
           <w:bCs/>
           <w:lang w:val="es-GT"/>
         </w:rPr>
-        <w:t>LALR(</w:t>
-      </w:r>
-      <w:proofErr w:type="gramEnd"/>
+        <w:t>LALR(1)</w:t>
+      </w:r>
+      <w:r>
+        <w:rPr>
+          <w:lang w:val="es-GT"/>
+        </w:rPr>
+        <w:t xml:space="preserve"> libre de contexto. Transforma la secuencia de tokens en un Árbol de Análisis Sintáctico (AST) utilizando la notación BNF (Backus-Naur Form).</w:t>
+      </w:r>
+    </w:p>
+    <w:p>
+      <w:pPr>
+        <w:jc w:val="both"/>
+        <w:rPr>
+          <w:lang w:val="es-GT"/>
+        </w:rPr>
+      </w:pPr>
       <w:r>
         <w:rPr>
           <w:b/>
           <w:bCs/>
           <w:lang w:val="es-GT"/>
         </w:rPr>
-        <w:t>1)</w:t>
-      </w:r>
-      <w:r>
-        <w:rPr>
-          <w:lang w:val="es-GT"/>
-        </w:rPr>
-        <w:t xml:space="preserve"> libre de contexto. Transforma la secuencia de tokens en un Árbol de Análisis Sintáctico (AST) utilizando la notación BNF (Backus-Naur Form).</w:t>
+        <w:t>Extracto de Gramática para Archivos .</w:t>
+      </w:r>
+      <w:proofErr w:type="spellStart"/>
+      <w:r>
+        <w:rPr>
+          <w:b/>
+          <w:bCs/>
+          <w:lang w:val="es-GT"/>
+        </w:rPr>
+        <w:t>form</w:t>
+      </w:r>
+      <w:proofErr w:type="spellEnd"/>
+      <w:r>
+        <w:rPr>
+          <w:b/>
+          <w:bCs/>
+          <w:lang w:val="es-GT"/>
+        </w:rPr>
+        <w:t xml:space="preserve"> (Lógica y Generación):</w:t>
       </w:r>
     </w:p>
     <w:p>
@@ -1506,39 +1424,9 @@
       </w:pPr>
       <w:r>
         <w:rPr>
-          <w:b/>
-          <w:bCs/>
-          <w:lang w:val="es-GT"/>
-        </w:rPr>
-        <w:t xml:space="preserve">Extracto de Gramática para </w:t>
-      </w:r>
-      <w:proofErr w:type="gramStart"/>
-      <w:r>
-        <w:rPr>
-          <w:b/>
-          <w:bCs/>
-          <w:lang w:val="es-GT"/>
-        </w:rPr>
-        <w:t>Archivos .</w:t>
-      </w:r>
-      <w:proofErr w:type="spellStart"/>
-      <w:r>
-        <w:rPr>
-          <w:b/>
-          <w:bCs/>
-          <w:lang w:val="es-GT"/>
-        </w:rPr>
-        <w:t>form</w:t>
-      </w:r>
-      <w:proofErr w:type="spellEnd"/>
-      <w:proofErr w:type="gramEnd"/>
-      <w:r>
-        <w:rPr>
-          <w:b/>
-          <w:bCs/>
-          <w:lang w:val="es-GT"/>
-        </w:rPr>
-        <w:t xml:space="preserve"> (Lógica y Generación):</w:t>
+          <w:lang w:val="es-GT"/>
+        </w:rPr>
+        <w:t>BNF</w:t>
       </w:r>
     </w:p>
     <w:p>
@@ -1552,7 +1440,7 @@
         <w:rPr>
           <w:lang w:val="es-GT"/>
         </w:rPr>
-        <w:t>BNF</w:t>
+        <w:t>&lt;inicio&gt;         ::= &lt;instrucciones&gt;</w:t>
       </w:r>
     </w:p>
     <w:p>
@@ -1566,21 +1454,35 @@
         <w:rPr>
           <w:lang w:val="es-GT"/>
         </w:rPr>
-        <w:t xml:space="preserve">&lt;inicio&gt;       </w:t>
-      </w:r>
-      <w:proofErr w:type="gramStart"/>
-      <w:r>
-        <w:rPr>
-          <w:lang w:val="es-GT"/>
-        </w:rPr>
-        <w:t xml:space="preserve">  ::=</w:t>
-      </w:r>
-      <w:proofErr w:type="gramEnd"/>
-      <w:r>
-        <w:rPr>
-          <w:lang w:val="es-GT"/>
-        </w:rPr>
-        <w:t xml:space="preserve"> &lt;instrucciones&gt;</w:t>
+        <w:t>&lt;instrucciones&gt;  ::= &lt;instrucciones&gt; &lt;</w:t>
+      </w:r>
+      <w:proofErr w:type="spellStart"/>
+      <w:r>
+        <w:rPr>
+          <w:lang w:val="es-GT"/>
+        </w:rPr>
+        <w:t>instruccion</w:t>
+      </w:r>
+      <w:proofErr w:type="spellEnd"/>
+      <w:r>
+        <w:rPr>
+          <w:lang w:val="es-GT"/>
+        </w:rPr>
+        <w:t>&gt; | &lt;</w:t>
+      </w:r>
+      <w:proofErr w:type="spellStart"/>
+      <w:r>
+        <w:rPr>
+          <w:lang w:val="es-GT"/>
+        </w:rPr>
+        <w:t>instruccion</w:t>
+      </w:r>
+      <w:proofErr w:type="spellEnd"/>
+      <w:r>
+        <w:rPr>
+          <w:lang w:val="es-GT"/>
+        </w:rPr>
+        <w:t>&gt;</w:t>
       </w:r>
     </w:p>
     <w:p>
@@ -1594,21 +1496,7 @@
         <w:rPr>
           <w:lang w:val="es-GT"/>
         </w:rPr>
-        <w:t>&lt;instrucciones</w:t>
-      </w:r>
-      <w:proofErr w:type="gramStart"/>
-      <w:r>
-        <w:rPr>
-          <w:lang w:val="es-GT"/>
-        </w:rPr>
-        <w:t>&gt;  :</w:t>
-      </w:r>
-      <w:proofErr w:type="gramEnd"/>
-      <w:r>
-        <w:rPr>
-          <w:lang w:val="es-GT"/>
-        </w:rPr>
-        <w:t>:= &lt;instrucciones&gt; &lt;</w:t>
+        <w:t>&lt;</w:t>
       </w:r>
       <w:proofErr w:type="spellStart"/>
       <w:r>
@@ -1622,6 +1510,20 @@
         <w:rPr>
           <w:lang w:val="es-GT"/>
         </w:rPr>
+        <w:t>&gt;    ::= &lt;</w:t>
+      </w:r>
+      <w:proofErr w:type="spellStart"/>
+      <w:r>
+        <w:rPr>
+          <w:lang w:val="es-GT"/>
+        </w:rPr>
+        <w:t>declaracion</w:t>
+      </w:r>
+      <w:proofErr w:type="spellEnd"/>
+      <w:r>
+        <w:rPr>
+          <w:lang w:val="es-GT"/>
+        </w:rPr>
         <w:t>&gt; | &lt;</w:t>
       </w:r>
       <w:proofErr w:type="spellStart"/>
@@ -1629,14 +1531,28 @@
         <w:rPr>
           <w:lang w:val="es-GT"/>
         </w:rPr>
-        <w:t>instruccion</w:t>
+        <w:t>asignacion</w:t>
       </w:r>
       <w:proofErr w:type="spellEnd"/>
       <w:r>
         <w:rPr>
           <w:lang w:val="es-GT"/>
         </w:rPr>
-        <w:t>&gt;</w:t>
+        <w:t>&gt; | &lt;</w:t>
+      </w:r>
+      <w:proofErr w:type="spellStart"/>
+      <w:r>
+        <w:rPr>
+          <w:lang w:val="es-GT"/>
+        </w:rPr>
+        <w:t>sentencia_if</w:t>
+      </w:r>
+      <w:proofErr w:type="spellEnd"/>
+      <w:r>
+        <w:rPr>
+          <w:lang w:val="es-GT"/>
+        </w:rPr>
+        <w:t xml:space="preserve">&gt; </w:t>
       </w:r>
     </w:p>
     <w:p>
@@ -1650,77 +1566,35 @@
         <w:rPr>
           <w:lang w:val="es-GT"/>
         </w:rPr>
-        <w:t>&lt;</w:t>
+        <w:t xml:space="preserve">                   | &lt;</w:t>
       </w:r>
       <w:proofErr w:type="spellStart"/>
       <w:r>
         <w:rPr>
           <w:lang w:val="es-GT"/>
         </w:rPr>
-        <w:t>instruccion</w:t>
+        <w:t>sentencia_for</w:t>
       </w:r>
       <w:proofErr w:type="spellEnd"/>
       <w:r>
         <w:rPr>
           <w:lang w:val="es-GT"/>
         </w:rPr>
-        <w:t xml:space="preserve">&gt;  </w:t>
-      </w:r>
-      <w:proofErr w:type="gramStart"/>
-      <w:r>
-        <w:rPr>
-          <w:lang w:val="es-GT"/>
-        </w:rPr>
-        <w:t xml:space="preserve">  ::=</w:t>
-      </w:r>
-      <w:proofErr w:type="gramEnd"/>
-      <w:r>
-        <w:rPr>
-          <w:lang w:val="es-GT"/>
-        </w:rPr>
-        <w:t xml:space="preserve"> &lt;</w:t>
+        <w:t>&gt; | &lt;</w:t>
       </w:r>
       <w:proofErr w:type="spellStart"/>
       <w:r>
         <w:rPr>
           <w:lang w:val="es-GT"/>
         </w:rPr>
-        <w:t>declaracion</w:t>
+        <w:t>componente_visual</w:t>
       </w:r>
       <w:proofErr w:type="spellEnd"/>
       <w:r>
         <w:rPr>
           <w:lang w:val="es-GT"/>
         </w:rPr>
-        <w:t>&gt; | &lt;</w:t>
-      </w:r>
-      <w:proofErr w:type="spellStart"/>
-      <w:r>
-        <w:rPr>
-          <w:lang w:val="es-GT"/>
-        </w:rPr>
-        <w:t>asignacion</w:t>
-      </w:r>
-      <w:proofErr w:type="spellEnd"/>
-      <w:r>
-        <w:rPr>
-          <w:lang w:val="es-GT"/>
-        </w:rPr>
-        <w:t>&gt; | &lt;</w:t>
-      </w:r>
-      <w:proofErr w:type="spellStart"/>
-      <w:r>
-        <w:rPr>
-          <w:lang w:val="es-GT"/>
-        </w:rPr>
-        <w:t>sentencia_if</w:t>
-      </w:r>
-      <w:proofErr w:type="spellEnd"/>
-      <w:r>
-        <w:rPr>
-          <w:lang w:val="es-GT"/>
-        </w:rPr>
-        <w:t xml:space="preserve">&gt; </w:t>
+        <w:t>&gt;</w:t>
       </w:r>
     </w:p>
     <w:p>
@@ -1730,40 +1604,6 @@
           <w:lang w:val="es-GT"/>
         </w:rPr>
       </w:pPr>
-      <w:r>
-        <w:rPr>
-          <w:lang w:val="es-GT"/>
-        </w:rPr>
-        <w:t xml:space="preserve">                   | &lt;</w:t>
-      </w:r>
-      <w:proofErr w:type="spellStart"/>
-      <w:r>
-        <w:rPr>
-          <w:lang w:val="es-GT"/>
-        </w:rPr>
-        <w:t>sentencia_for</w:t>
-      </w:r>
-      <w:proofErr w:type="spellEnd"/>
-      <w:r>
-        <w:rPr>
-          <w:lang w:val="es-GT"/>
-        </w:rPr>
-        <w:t>&gt; | &lt;</w:t>
-      </w:r>
-      <w:proofErr w:type="spellStart"/>
-      <w:r>
-        <w:rPr>
-          <w:lang w:val="es-GT"/>
-        </w:rPr>
-        <w:t>componente_visual</w:t>
-      </w:r>
-      <w:proofErr w:type="spellEnd"/>
-      <w:r>
-        <w:rPr>
-          <w:lang w:val="es-GT"/>
-        </w:rPr>
-        <w:t>&gt;</w:t>
-      </w:r>
     </w:p>
     <w:p>
       <w:pPr>
@@ -1772,14 +1612,6 @@
           <w:lang w:val="es-GT"/>
         </w:rPr>
       </w:pPr>
-    </w:p>
-    <w:p>
-      <w:pPr>
-        <w:jc w:val="both"/>
-        <w:rPr>
-          <w:lang w:val="es-GT"/>
-        </w:rPr>
-      </w:pPr>
       <w:r>
         <w:rPr>
           <w:lang w:val="es-GT"/>
@@ -1794,19 +1626,11 @@
         <w:t>componente_visual</w:t>
       </w:r>
       <w:proofErr w:type="spellEnd"/>
-      <w:proofErr w:type="gramStart"/>
-      <w:r>
-        <w:rPr>
-          <w:lang w:val="es-GT"/>
-        </w:rPr>
-        <w:t>&gt; ::=</w:t>
-      </w:r>
-      <w:proofErr w:type="gramEnd"/>
-      <w:r>
-        <w:rPr>
-          <w:lang w:val="es-GT"/>
-        </w:rPr>
-        <w:t xml:space="preserve"> SECCION CORCHETE_A &lt;</w:t>
+      <w:r>
+        <w:rPr>
+          <w:lang w:val="es-GT"/>
+        </w:rPr>
+        <w:t>&gt; ::= SECCION CORCHETE_A &lt;</w:t>
       </w:r>
       <w:proofErr w:type="spellStart"/>
       <w:r>
@@ -1890,34 +1714,24 @@
           <w:bCs/>
           <w:lang w:val="es-GT"/>
         </w:rPr>
-        <w:t xml:space="preserve">Extracto de Gramática para </w:t>
-      </w:r>
-      <w:proofErr w:type="gramStart"/>
+        <w:t>Extracto de Gramática para Archivos .</w:t>
+      </w:r>
+      <w:proofErr w:type="spellStart"/>
       <w:r>
         <w:rPr>
           <w:b/>
           <w:bCs/>
           <w:lang w:val="es-GT"/>
         </w:rPr>
-        <w:t>Archivos .</w:t>
-      </w:r>
-      <w:proofErr w:type="spellStart"/>
+        <w:t>pkm</w:t>
+      </w:r>
+      <w:proofErr w:type="spellEnd"/>
       <w:r>
         <w:rPr>
           <w:b/>
           <w:bCs/>
           <w:lang w:val="es-GT"/>
         </w:rPr>
-        <w:t>pkm</w:t>
-      </w:r>
-      <w:proofErr w:type="spellEnd"/>
-      <w:proofErr w:type="gramEnd"/>
-      <w:r>
-        <w:rPr>
-          <w:b/>
-          <w:bCs/>
-          <w:lang w:val="es-GT"/>
-        </w:rPr>
         <w:t xml:space="preserve"> (Marcado Estático):</w:t>
       </w:r>
     </w:p>
@@ -1960,21 +1774,7 @@
         <w:rPr>
           <w:lang w:val="es-GT"/>
         </w:rPr>
-        <w:t xml:space="preserve">&gt; </w:t>
-      </w:r>
-      <w:proofErr w:type="gramStart"/>
-      <w:r>
-        <w:rPr>
-          <w:lang w:val="es-GT"/>
-        </w:rPr>
-        <w:t xml:space="preserve">  ::=</w:t>
-      </w:r>
-      <w:proofErr w:type="gramEnd"/>
-      <w:r>
-        <w:rPr>
-          <w:lang w:val="es-GT"/>
-        </w:rPr>
-        <w:t xml:space="preserve"> &lt;</w:t>
+        <w:t>&gt;   ::= &lt;</w:t>
       </w:r>
       <w:proofErr w:type="spellStart"/>
       <w:r>
@@ -2016,21 +1816,7 @@
         <w:rPr>
           <w:lang w:val="es-GT"/>
         </w:rPr>
-        <w:t xml:space="preserve">&lt;componente&gt; </w:t>
-      </w:r>
-      <w:proofErr w:type="gramStart"/>
-      <w:r>
-        <w:rPr>
-          <w:lang w:val="es-GT"/>
-        </w:rPr>
-        <w:t xml:space="preserve">  ::=</w:t>
-      </w:r>
-      <w:proofErr w:type="gramEnd"/>
-      <w:r>
-        <w:rPr>
-          <w:lang w:val="es-GT"/>
-        </w:rPr>
-        <w:t xml:space="preserve"> MENORQUE SECTION IGUAL &lt;</w:t>
+        <w:t>&lt;componente&gt;   ::= MENORQUE SECTION IGUAL &lt;</w:t>
       </w:r>
       <w:proofErr w:type="spellStart"/>
       <w:r>
@@ -2095,75 +1881,14 @@
           <w:lang w:val="es-GT"/>
         </w:rPr>
       </w:pPr>
-    </w:p>
-    <w:p>
-      <w:pPr>
-        <w:rPr>
-          <w:lang w:val="es-GT"/>
-        </w:rPr>
-      </w:pPr>
       <w:r>
         <w:rPr>
           <w:lang w:val="es-GT"/>
         </w:rPr>
         <w:pict w14:anchorId="1CB64BE8">
-          <v:rect id="_x0000_i1056" style="width:0;height:1.5pt" o:hralign="center" o:hrstd="t" o:hr="t" fillcolor="#a0a0a0" stroked="f"/>
+          <v:rect id="_x0000_i1026" style="width:0;height:1.5pt" o:hralign="center" o:hrstd="t" o:hr="t" fillcolor="#a0a0a0" stroked="f"/>
         </w:pict>
       </w:r>
-    </w:p>
-    <w:p>
-      <w:pPr>
-        <w:rPr>
-          <w:b/>
-          <w:bCs/>
-          <w:lang w:val="es-GT"/>
-        </w:rPr>
-      </w:pPr>
-    </w:p>
-    <w:p>
-      <w:pPr>
-        <w:rPr>
-          <w:b/>
-          <w:bCs/>
-          <w:lang w:val="es-GT"/>
-        </w:rPr>
-      </w:pPr>
-    </w:p>
-    <w:p>
-      <w:pPr>
-        <w:rPr>
-          <w:b/>
-          <w:bCs/>
-          <w:lang w:val="es-GT"/>
-        </w:rPr>
-      </w:pPr>
-    </w:p>
-    <w:p>
-      <w:pPr>
-        <w:rPr>
-          <w:b/>
-          <w:bCs/>
-          <w:lang w:val="es-GT"/>
-        </w:rPr>
-      </w:pPr>
-    </w:p>
-    <w:p>
-      <w:pPr>
-        <w:rPr>
-          <w:b/>
-          <w:bCs/>
-          <w:lang w:val="es-GT"/>
-        </w:rPr>
-      </w:pPr>
-    </w:p>
-    <w:p>
-      <w:pPr>
-        <w:rPr>
-          <w:b/>
-          <w:bCs/>
-          <w:lang w:val="es-GT"/>
-        </w:rPr>
-      </w:pPr>
     </w:p>
     <w:p>
       <w:r>
@@ -2255,7 +1980,7 @@
     </w:p>
     <w:sectPr>
       <w:pgSz w:w="11906" w:h="16838" w:code="9"/>
-      <w:pgMar w:top="720" w:right="720" w:bottom="720" w:left="720" w:header="720" w:footer="720" w:gutter="0"/>
+      <w:pgMar w:top="1417" w:right="1701" w:bottom="1417" w:left="1701" w:header="720" w:footer="720" w:gutter="0"/>
       <w:pgNumType w:start="0"/>
       <w:cols w:space="720"/>
       <w:titlePg/>
@@ -4871,6 +4596,7 @@
   <w:style w:type="character" w:default="1" w:styleId="Fuentedeprrafopredeter">
     <w:name w:val="Default Paragraph Font"/>
     <w:uiPriority w:val="1"/>
+    <w:semiHidden/>
     <w:unhideWhenUsed/>
   </w:style>
   <w:style w:type="table" w:default="1" w:styleId="Tablanormal">
@@ -6211,7 +5937,10 @@
   </w:compat>
   <w:rsids>
     <w:rsidRoot w:val="00104271"/>
+    <w:rsid w:val="0002419F"/>
+    <w:rsid w:val="00050198"/>
     <w:rsid w:val="00104271"/>
+    <w:rsid w:val="004D06C9"/>
     <w:rsid w:val="00B70128"/>
   </w:rsids>
   <m:mathPr>
@@ -6724,9 +6453,6 @@
   <w:style w:type="paragraph" w:customStyle="1" w:styleId="ABFE1C54F44E4D168492C1F059D39742">
     <w:name w:val="ABFE1C54F44E4D168492C1F059D39742"/>
   </w:style>
-  <w:style w:type="paragraph" w:customStyle="1" w:styleId="1480C2A8DC114F2080B25E8C19C7CD44">
-    <w:name w:val="1480C2A8DC114F2080B25E8C19C7CD44"/>
-  </w:style>
   <w:style w:type="paragraph" w:styleId="Listaconvietas">
     <w:name w:val="List Bullet"/>
     <w:basedOn w:val="Normal"/>
@@ -6746,15 +6472,6 @@
       <w:lang w:val="es-ES" w:eastAsia="ja-JP"/>
       <w14:ligatures w14:val="none"/>
     </w:rPr>
-  </w:style>
-  <w:style w:type="paragraph" w:customStyle="1" w:styleId="8B2CB006DC8E4921BA17E285A78FF4FD">
-    <w:name w:val="8B2CB006DC8E4921BA17E285A78FF4FD"/>
-  </w:style>
-  <w:style w:type="paragraph" w:customStyle="1" w:styleId="4451CB29206B4C84A64CEEB0F3FBCC30">
-    <w:name w:val="4451CB29206B4C84A64CEEB0F3FBCC30"/>
-  </w:style>
-  <w:style w:type="paragraph" w:customStyle="1" w:styleId="D70D720BF96C4740B34639359FF802DD">
-    <w:name w:val="D70D720BF96C4740B34639359FF802DD"/>
   </w:style>
 </w:styles>
 </file>
@@ -6992,39 +6709,6 @@
 </file>
 
 <file path=customXml/item1.xml><?xml version="1.0" encoding="utf-8"?>
-<p:properties xmlns:p="http://schemas.microsoft.com/office/2006/metadata/properties" xmlns:xsi="http://www.w3.org/2001/XMLSchema-instance" xmlns:pc="http://schemas.microsoft.com/office/infopath/2007/PartnerControls">
-  <documentManagement>
-    <_ip_UnifiedCompliancePolicyUIAction xmlns="http://schemas.microsoft.com/sharepoint/v3" xsi:nil="true"/>
-    <Image xmlns="71af3243-3dd4-4a8d-8c0d-dd76da1f02a5">
-      <Url xsi:nil="true"/>
-      <Description xsi:nil="true"/>
-    </Image>
-    <Status xmlns="71af3243-3dd4-4a8d-8c0d-dd76da1f02a5">Not started</Status>
-    <Background xmlns="71af3243-3dd4-4a8d-8c0d-dd76da1f02a5">false</Background>
-    <_ip_UnifiedCompliancePolicyProperties xmlns="http://schemas.microsoft.com/sharepoint/v3" xsi:nil="true"/>
-    <ImageTagsTaxHTField xmlns="71af3243-3dd4-4a8d-8c0d-dd76da1f02a5">
-      <Terms xmlns="http://schemas.microsoft.com/office/infopath/2007/PartnerControls"/>
-    </ImageTagsTaxHTField>
-    <TaxCatchAll xmlns="230e9df3-be65-4c73-a93b-d1236ebd677e" xsi:nil="true"/>
-    <MediaServiceKeyPoints xmlns="71af3243-3dd4-4a8d-8c0d-dd76da1f02a5" xsi:nil="true"/>
-  </documentManagement>
-</p:properties>
-</file>
-
-<file path=customXml/item2.xml><?xml version="1.0" encoding="utf-8"?>
-<?mso-contentType ?>
-<FormTemplates xmlns="http://schemas.microsoft.com/sharepoint/v3/contenttype/forms">
-  <Display>DocumentLibraryForm</Display>
-  <Edit>DocumentLibraryForm</Edit>
-  <New>DocumentLibraryForm</New>
-</FormTemplates>
-</file>
-
-<file path=customXml/item3.xml><?xml version="1.0" encoding="utf-8"?>
-<b:Sources xmlns:b="http://schemas.openxmlformats.org/officeDocument/2006/bibliography" xmlns="http://schemas.openxmlformats.org/officeDocument/2006/bibliography" SelectedStyle="\APASixthEditionOfficeOnline.xsl" StyleName="APA" Version="6"/>
-</file>
-
-<file path=customXml/item4.xml><?xml version="1.0" encoding="utf-8"?>
 <ct:contentTypeSchema xmlns:ct="http://schemas.microsoft.com/office/2006/metadata/contentType" xmlns:ma="http://schemas.microsoft.com/office/2006/metadata/properties/metaAttributes" ct:_="" ma:_="" ma:contentTypeName="Document" ma:contentTypeID="0x01010079F111ED35F8CC479449609E8A0923A6" ma:contentTypeVersion="26" ma:contentTypeDescription="Create a new document." ma:contentTypeScope="" ma:versionID="ac37c1753acd5e330d2062ccec26ea66">
   <xsd:schema xmlns:xsd="http://www.w3.org/2001/XMLSchema" xmlns:xs="http://www.w3.org/2001/XMLSchema" xmlns:p="http://schemas.microsoft.com/office/2006/metadata/properties" xmlns:ns1="http://schemas.microsoft.com/sharepoint/v3" xmlns:ns2="71af3243-3dd4-4a8d-8c0d-dd76da1f02a5" xmlns:ns3="16c05727-aa75-4e4a-9b5f-8a80a1165891" xmlns:ns4="230e9df3-be65-4c73-a93b-d1236ebd677e" targetNamespace="http://schemas.microsoft.com/office/2006/metadata/properties" ma:root="true" ma:fieldsID="3b340c7101c92c5120abd06486f94548" ns1:_="" ns2:_="" ns3:_="" ns4:_="">
     <xsd:import namespace="http://schemas.microsoft.com/sharepoint/v3"/>
@@ -7324,35 +7008,40 @@
 </ct:contentTypeSchema>
 </file>
 
-<file path=customXml/itemProps1.xml><?xml version="1.0" encoding="utf-8"?>
-<ds:datastoreItem xmlns:ds="http://schemas.openxmlformats.org/officeDocument/2006/customXml" ds:itemID="{6C6B1F4B-D2C7-4080-9F0A-9A425E0F546B}">
-  <ds:schemaRefs>
-    <ds:schemaRef ds:uri="http://schemas.microsoft.com/office/2006/metadata/properties"/>
-    <ds:schemaRef ds:uri="http://schemas.microsoft.com/office/infopath/2007/PartnerControls"/>
-    <ds:schemaRef ds:uri="http://schemas.microsoft.com/sharepoint/v3"/>
-    <ds:schemaRef ds:uri="71af3243-3dd4-4a8d-8c0d-dd76da1f02a5"/>
-    <ds:schemaRef ds:uri="230e9df3-be65-4c73-a93b-d1236ebd677e"/>
-  </ds:schemaRefs>
-</ds:datastoreItem>
+<file path=customXml/item2.xml><?xml version="1.0" encoding="utf-8"?>
+<b:Sources xmlns:b="http://schemas.openxmlformats.org/officeDocument/2006/bibliography" xmlns="http://schemas.openxmlformats.org/officeDocument/2006/bibliography" SelectedStyle="\APASixthEditionOfficeOnline.xsl" StyleName="APA" Version="6"/>
 </file>
 
-<file path=customXml/itemProps2.xml><?xml version="1.0" encoding="utf-8"?>
-<ds:datastoreItem xmlns:ds="http://schemas.openxmlformats.org/officeDocument/2006/customXml" ds:itemID="{05968AED-7063-4155-91A2-8C47F2991388}">
-  <ds:schemaRefs>
-    <ds:schemaRef ds:uri="http://schemas.microsoft.com/sharepoint/v3/contenttype/forms"/>
-  </ds:schemaRefs>
-</ds:datastoreItem>
+<file path=customXml/item3.xml><?xml version="1.0" encoding="utf-8"?>
+<?mso-contentType ?>
+<FormTemplates xmlns="http://schemas.microsoft.com/sharepoint/v3/contenttype/forms">
+  <Display>DocumentLibraryForm</Display>
+  <Edit>DocumentLibraryForm</Edit>
+  <New>DocumentLibraryForm</New>
+</FormTemplates>
 </file>
 
-<file path=customXml/itemProps3.xml><?xml version="1.0" encoding="utf-8"?>
-<ds:datastoreItem xmlns:ds="http://schemas.openxmlformats.org/officeDocument/2006/customXml" ds:itemID="{F35B2DF4-75B4-48EB-84C5-AD1E3FA0632F}">
-  <ds:schemaRefs>
-    <ds:schemaRef ds:uri="http://schemas.openxmlformats.org/officeDocument/2006/bibliography"/>
-  </ds:schemaRefs>
-</ds:datastoreItem>
+<file path=customXml/item4.xml><?xml version="1.0" encoding="utf-8"?>
+<p:properties xmlns:p="http://schemas.microsoft.com/office/2006/metadata/properties" xmlns:xsi="http://www.w3.org/2001/XMLSchema-instance" xmlns:pc="http://schemas.microsoft.com/office/infopath/2007/PartnerControls">
+  <documentManagement>
+    <_ip_UnifiedCompliancePolicyUIAction xmlns="http://schemas.microsoft.com/sharepoint/v3" xsi:nil="true"/>
+    <Image xmlns="71af3243-3dd4-4a8d-8c0d-dd76da1f02a5">
+      <Url xsi:nil="true"/>
+      <Description xsi:nil="true"/>
+    </Image>
+    <Status xmlns="71af3243-3dd4-4a8d-8c0d-dd76da1f02a5">Not started</Status>
+    <Background xmlns="71af3243-3dd4-4a8d-8c0d-dd76da1f02a5">false</Background>
+    <_ip_UnifiedCompliancePolicyProperties xmlns="http://schemas.microsoft.com/sharepoint/v3" xsi:nil="true"/>
+    <ImageTagsTaxHTField xmlns="71af3243-3dd4-4a8d-8c0d-dd76da1f02a5">
+      <Terms xmlns="http://schemas.microsoft.com/office/infopath/2007/PartnerControls"/>
+    </ImageTagsTaxHTField>
+    <TaxCatchAll xmlns="230e9df3-be65-4c73-a93b-d1236ebd677e" xsi:nil="true"/>
+    <MediaServiceKeyPoints xmlns="71af3243-3dd4-4a8d-8c0d-dd76da1f02a5" xsi:nil="true"/>
+  </documentManagement>
+</p:properties>
 </file>
 
-<file path=customXml/itemProps4.xml><?xml version="1.0" encoding="utf-8"?>
+<file path=customXml/itemProps1.xml><?xml version="1.0" encoding="utf-8"?>
 <ds:datastoreItem xmlns:ds="http://schemas.openxmlformats.org/officeDocument/2006/customXml" ds:itemID="{92B2DCC7-1BFB-4EB6-93AC-2EA6D15DABDA}">
   <ds:schemaRefs>
     <ds:schemaRef ds:uri="http://schemas.microsoft.com/office/2006/metadata/contentType"/>
@@ -7373,6 +7062,34 @@
 </ds:datastoreItem>
 </file>
 
+<file path=customXml/itemProps2.xml><?xml version="1.0" encoding="utf-8"?>
+<ds:datastoreItem xmlns:ds="http://schemas.openxmlformats.org/officeDocument/2006/customXml" ds:itemID="{F35B2DF4-75B4-48EB-84C5-AD1E3FA0632F}">
+  <ds:schemaRefs>
+    <ds:schemaRef ds:uri="http://schemas.openxmlformats.org/officeDocument/2006/bibliography"/>
+  </ds:schemaRefs>
+</ds:datastoreItem>
+</file>
+
+<file path=customXml/itemProps3.xml><?xml version="1.0" encoding="utf-8"?>
+<ds:datastoreItem xmlns:ds="http://schemas.openxmlformats.org/officeDocument/2006/customXml" ds:itemID="{05968AED-7063-4155-91A2-8C47F2991388}">
+  <ds:schemaRefs>
+    <ds:schemaRef ds:uri="http://schemas.microsoft.com/sharepoint/v3/contenttype/forms"/>
+  </ds:schemaRefs>
+</ds:datastoreItem>
+</file>
+
+<file path=customXml/itemProps4.xml><?xml version="1.0" encoding="utf-8"?>
+<ds:datastoreItem xmlns:ds="http://schemas.openxmlformats.org/officeDocument/2006/customXml" ds:itemID="{6C6B1F4B-D2C7-4080-9F0A-9A425E0F546B}">
+  <ds:schemaRefs>
+    <ds:schemaRef ds:uri="http://schemas.microsoft.com/office/2006/metadata/properties"/>
+    <ds:schemaRef ds:uri="http://schemas.microsoft.com/office/infopath/2007/PartnerControls"/>
+    <ds:schemaRef ds:uri="http://schemas.microsoft.com/sharepoint/v3"/>
+    <ds:schemaRef ds:uri="71af3243-3dd4-4a8d-8c0d-dd76da1f02a5"/>
+    <ds:schemaRef ds:uri="230e9df3-be65-4c73-a93b-d1236ebd677e"/>
+  </ds:schemaRefs>
+</ds:datastoreItem>
+</file>
+
 <file path=docMetadata/LabelInfo.xml><?xml version="1.0" encoding="utf-8"?>
 <clbl:labelList xmlns:clbl="http://schemas.microsoft.com/office/2020/mipLabelMetadata"/>
 </file>
</xml_diff>